<commit_message>
Add Active Deploys section to resume site
List the live Cloudflare Workers deployments after the profile, each
link followed by a one-line description of what it does.

Mirror the section in Matthew_DeVoss_FDE_Resume.docx, matching the
existing heading and body formatting, with the URLs as real hyperlinks.

Co-Authored-By: Claude Opus 5 <noreply@anthropic.com>
Claude-Session: https://claude.ai/code/session_01UnKpkhzWn1oCxYjEAnojAi
</commit_message>
<xml_diff>
--- a/public/Matthew_DeVoss_FDE_Resume.docx
+++ b/public/Matthew_DeVoss_FDE_Resume.docx
@@ -168,6 +168,109 @@
           <w:sz w:val="19"/>
         </w:rPr>
         <w:t>Full-stack engineer and technical lead who works where the customer is. Fifteen years building user-facing products, the last decade embedded on high-assurance defense and space programs — sitting with NASA science teams and U.S. Army stakeholders, turning ambiguous, in-person requirements into working software demonstrated back to them every two weeks. I take products from command-line prototype to delivered application, lead the small teams that ship them, and stay in the codebase the whole way. I build and deploy with AI coding agents daily — Claude Code and Devin push my changes to live production sites — which collapses the gap between a customer asking for something and using it.</w:t>
+      </w:r>
+    </w:p>
+    <w:p>
+      <w:pPr>
+        <w:spacing w:before="220" w:after="60"/>
+        <w:pBdr>
+          <w:bottom w:val="single" w:sz="6" w:space="2" w:color="B9C4D0"/>
+        </w:pBdr>
+      </w:pPr>
+      <w:r>
+        <w:rPr>
+          <w:rFonts w:ascii="Calibri" w:hAnsi="Calibri"/>
+          <w:b/>
+          <w:i w:val="0"/>
+          <w:color w:val="1F3A5F"/>
+          <w:sz w:val="19"/>
+          <w:spacing w:val="32"/>
+        </w:rPr>
+        <w:t>ACTIVE DEPLOYS</w:t>
+      </w:r>
+    </w:p>
+    <w:p>
+      <w:pPr>
+        <w:spacing w:before="30" w:after="0"/>
+      </w:pPr>
+      <w:hyperlink r:id="rIdDeploy0">
+        <w:r>
+          <w:rPr>
+            <w:rFonts w:ascii="Calibri" w:hAnsi="Calibri"/>
+            <w:b/>
+            <w:i w:val="0"/>
+            <w:color w:val="1F3A5F"/>
+            <w:sz w:val="19"/>
+            <w:u w:val="single"/>
+          </w:rPr>
+          <w:t>resume.mattdevoss.workers.dev</w:t>
+        </w:r>
+      </w:hyperlink>
+      <w:r>
+        <w:rPr>
+          <w:rFonts w:ascii="Calibri" w:hAnsi="Calibri"/>
+          <w:b w:val="0"/>
+          <w:i w:val="0"/>
+          <w:color w:val="2B2B2B"/>
+          <w:sz w:val="19"/>
+        </w:rPr>
+        <w:t xml:space="preserve">  —  this resume, served as a static-asset Worker from Cloudflare’s edge.</w:t>
+      </w:r>
+    </w:p>
+    <w:p>
+      <w:pPr>
+        <w:spacing w:before="60" w:after="0"/>
+      </w:pPr>
+      <w:hyperlink r:id="rIdDeploy1">
+        <w:r>
+          <w:rPr>
+            <w:rFonts w:ascii="Calibri" w:hAnsi="Calibri"/>
+            <w:b/>
+            <w:i w:val="0"/>
+            <w:color w:val="1F3A5F"/>
+            <w:sz w:val="19"/>
+            <w:u w:val="single"/>
+          </w:rPr>
+          <w:t>dodgers-dashboard.mattdevoss.workers.dev</w:t>
+        </w:r>
+      </w:hyperlink>
+      <w:r>
+        <w:rPr>
+          <w:rFonts w:ascii="Calibri" w:hAnsi="Calibri"/>
+          <w:b w:val="0"/>
+          <w:i w:val="0"/>
+          <w:color w:val="2B2B2B"/>
+          <w:sz w:val="19"/>
+        </w:rPr>
+        <w:t xml:space="preserve">  —  single-page Dodgers dashboard over the MLB Stats API: schedule, standings, roster, and a merged news feed, with edge-cached Worker routes and AI-written trade scenarios via Claude.</w:t>
+      </w:r>
+    </w:p>
+    <w:p>
+      <w:pPr>
+        <w:spacing w:before="60" w:after="0"/>
+      </w:pPr>
+      <w:hyperlink r:id="rIdDeploy2">
+        <w:r>
+          <w:rPr>
+            <w:rFonts w:ascii="Calibri" w:hAnsi="Calibri"/>
+            <w:b/>
+            <w:i w:val="0"/>
+            <w:color w:val="1F3A5F"/>
+            <w:sz w:val="19"/>
+            <w:u w:val="single"/>
+          </w:rPr>
+          <w:t>eastwestnewsservice.mattdevoss.workers.dev</w:t>
+        </w:r>
+      </w:hyperlink>
+      <w:r>
+        <w:rPr>
+          <w:rFonts w:ascii="Calibri" w:hAnsi="Calibri"/>
+          <w:b w:val="0"/>
+          <w:i w:val="0"/>
+          <w:color w:val="2B2B2B"/>
+          <w:sz w:val="19"/>
+        </w:rPr>
+        <w:t xml:space="preserve">  —  server-rendered newspaper front end for a live WordPress REST API, built per request at the edge with no copied or stored content.</w:t>
       </w:r>
     </w:p>
     <w:p>

</xml_diff>

<commit_message>
Lead with Active Deploys, add Just Go, and rewrite the profile
Co-Authored-By: Claude Opus 5 <noreply@anthropic.com>
Claude-Session: https://claude.ai/code/session_01HQsZy25pUAHAeXe2RWF4WN
</commit_message>
<xml_diff>
--- a/public/Matthew_DeVoss_FDE_Resume.docx
+++ b/public/Matthew_DeVoss_FDE_Resume.docx
@@ -152,40 +152,6 @@
           <w:sz w:val="19"/>
           <w:spacing w:val="32"/>
         </w:rPr>
-        <w:t>PROFILE</w:t>
-      </w:r>
-    </w:p>
-    <w:p>
-      <w:pPr>
-        <w:spacing w:before="40" w:after="0"/>
-      </w:pPr>
-      <w:r>
-        <w:rPr>
-          <w:rFonts w:ascii="Calibri" w:hAnsi="Calibri"/>
-          <w:b w:val="0"/>
-          <w:i w:val="0"/>
-          <w:color w:val="2B2B2B"/>
-          <w:sz w:val="19"/>
-        </w:rPr>
-        <w:t>Full-stack engineer and technical lead who works where the customer is. Fifteen years building user-facing products, the last decade embedded on high-assurance defense and space programs — sitting with NASA science teams and U.S. Army stakeholders, turning ambiguous, in-person requirements into working software demonstrated back to them every two weeks. I take products from command-line prototype to delivered application, lead the small teams that ship them, and stay in the codebase the whole way. I build and deploy with AI coding agents daily — Claude Code and Devin push my changes to live production sites — which collapses the gap between a customer asking for something and using it.</w:t>
-      </w:r>
-    </w:p>
-    <w:p>
-      <w:pPr>
-        <w:spacing w:before="220" w:after="60"/>
-        <w:pBdr>
-          <w:bottom w:val="single" w:sz="6" w:space="2" w:color="B9C4D0"/>
-        </w:pBdr>
-      </w:pPr>
-      <w:r>
-        <w:rPr>
-          <w:rFonts w:ascii="Calibri" w:hAnsi="Calibri"/>
-          <w:b/>
-          <w:i w:val="0"/>
-          <w:color w:val="1F3A5F"/>
-          <w:sz w:val="19"/>
-          <w:spacing w:val="32"/>
-        </w:rPr>
         <w:t>ACTIVE DEPLOYS</w:t>
       </w:r>
     </w:p>
@@ -271,6 +237,68 @@
           <w:sz w:val="19"/>
         </w:rPr>
         <w:t xml:space="preserve">  —  server-rendered newspaper for my father’s business</w:t>
+      </w:r>
+    </w:p>
+    <w:p>
+      <w:pPr>
+        <w:spacing w:before="60" w:after="0"/>
+      </w:pPr>
+      <w:hyperlink r:id="rIdDeploy3">
+        <w:r>
+          <w:rPr>
+            <w:rFonts w:ascii="Calibri" w:hAnsi="Calibri"/>
+            <w:b/>
+            <w:i w:val="0"/>
+            <w:color w:val="1F3A5F"/>
+            <w:sz w:val="19"/>
+            <w:u w:val="single"/>
+          </w:rPr>
+          <w:t>just-go.mattdevoss.workers.dev</w:t>
+        </w:r>
+      </w:hyperlink>
+      <w:r>
+        <w:rPr>
+          <w:rFonts w:ascii="Calibri" w:hAnsi="Calibri"/>
+          <w:b w:val="0"/>
+          <w:i w:val="0"/>
+          <w:color w:val="2B2B2B"/>
+          <w:sz w:val="19"/>
+        </w:rPr>
+        <w:t xml:space="preserve">  —  random-destination trip picker that draws the great-circle route from LAX on a three.js globe, built so page loads never touch a paid API.</w:t>
+      </w:r>
+    </w:p>
+    <w:p>
+      <w:pPr>
+        <w:spacing w:before="220" w:after="60"/>
+        <w:pBdr>
+          <w:bottom w:val="single" w:sz="6" w:space="2" w:color="B9C4D0"/>
+        </w:pBdr>
+      </w:pPr>
+      <w:r>
+        <w:rPr>
+          <w:rFonts w:ascii="Calibri" w:hAnsi="Calibri"/>
+          <w:b/>
+          <w:i w:val="0"/>
+          <w:color w:val="1F3A5F"/>
+          <w:sz w:val="19"/>
+          <w:spacing w:val="32"/>
+        </w:rPr>
+        <w:t>PROFILE</w:t>
+      </w:r>
+    </w:p>
+    <w:p>
+      <w:pPr>
+        <w:spacing w:before="40" w:after="0"/>
+      </w:pPr>
+      <w:r>
+        <w:rPr>
+          <w:rFonts w:ascii="Calibri" w:hAnsi="Calibri"/>
+          <w:b w:val="0"/>
+          <w:i w:val="0"/>
+          <w:color w:val="2B2B2B"/>
+          <w:sz w:val="19"/>
+        </w:rPr>
+        <w:t>Full-stack engineer and technical lead and now with AI, a Forward Deployed Engineer. Fifteen years building user-facing products in defense and space programs including NASA and U.S. Army. Software demonstrated every two weeks. I take products from command-line prototype to delivered application. Today, I build and deploy with AI coding agents daily — Claude Code and Devin push my changes to live production sites — which collapses the gap between a customer asking for something and using it.</w:t>
       </w:r>
     </w:p>
     <w:p>

</xml_diff>

<commit_message>
Move unfollowed into Active Deploys, add Checklist, and drop Projects
unfollowed was the only entry in its own Projects section, listed as
unfollowed.info. It is now an Active Deploys entry at
unfollowed.mattdevoss.workers.dev (30,000 monthly active users; a snippet that
shows who doesn't follow you back on Instagram), next to the new
checklist.mattdevoss.workers.dev. The Projects section and its .proj styles
are gone. The Word resume carries the same edits.

Co-Authored-By: Claude Opus 5 <noreply@anthropic.com>
</commit_message>
<xml_diff>
--- a/public/Matthew_DeVoss_FDE_Resume.docx
+++ b/public/Matthew_DeVoss_FDE_Resume.docx
@@ -265,6 +265,62 @@
           <w:sz w:val="19"/>
         </w:rPr>
         <w:t xml:space="preserve">  —  random-destination trip picker that draws the great-circle route from LAX on a three.js globe, built so page loads never touch a paid API.</w:t>
+      </w:r>
+    </w:p>
+    <w:p>
+      <w:pPr>
+        <w:spacing w:before="60" w:after="0"/>
+      </w:pPr>
+      <w:hyperlink r:id="rIdDeploy4">
+        <w:r>
+          <w:rPr>
+            <w:rFonts w:ascii="Calibri" w:hAnsi="Calibri"/>
+            <w:b/>
+            <w:i w:val="0"/>
+            <w:color w:val="1F3A5F"/>
+            <w:sz w:val="19"/>
+            <w:u w:val="single"/>
+          </w:rPr>
+          <w:t>unfollowed.mattdevoss.workers.dev</w:t>
+        </w:r>
+      </w:hyperlink>
+      <w:r>
+        <w:rPr>
+          <w:rFonts w:ascii="Calibri" w:hAnsi="Calibri"/>
+          <w:b w:val="0"/>
+          <w:i w:val="0"/>
+          <w:color w:val="2B2B2B"/>
+          <w:sz w:val="19"/>
+        </w:rPr>
+        <w:t xml:space="preserve">  —  30,000 monthly active users. Site gives code snippet to find out who doesn’t follow you back on Instagram.</w:t>
+      </w:r>
+    </w:p>
+    <w:p>
+      <w:pPr>
+        <w:spacing w:before="60" w:after="0"/>
+      </w:pPr>
+      <w:hyperlink r:id="rIdDeploy5">
+        <w:r>
+          <w:rPr>
+            <w:rFonts w:ascii="Calibri" w:hAnsi="Calibri"/>
+            <w:b/>
+            <w:i w:val="0"/>
+            <w:color w:val="1F3A5F"/>
+            <w:sz w:val="19"/>
+            <w:u w:val="single"/>
+          </w:rPr>
+          <w:t>checklist.mattdevoss.workers.dev</w:t>
+        </w:r>
+      </w:hyperlink>
+      <w:r>
+        <w:rPr>
+          <w:rFonts w:ascii="Calibri" w:hAnsi="Calibri"/>
+          <w:b w:val="0"/>
+          <w:i w:val="0"/>
+          <w:color w:val="2B2B2B"/>
+          <w:sz w:val="19"/>
+        </w:rPr>
+        <w:t xml:space="preserve">  —  daily checklist that clears its checks at 2:00 AM local time, kept entirely in the browser’s localStorage and served as a static-asset Worker with no backend.</w:t>
       </w:r>
     </w:p>
     <w:p>
@@ -973,84 +1029,6 @@
           <w:sz w:val="19"/>
           <w:spacing w:val="32"/>
         </w:rPr>
-        <w:t>PROJECTS</w:t>
-      </w:r>
-    </w:p>
-    <w:p>
-      <w:pPr>
-        <w:spacing w:before="60" w:after="20"/>
-      </w:pPr>
-      <w:r>
-        <w:rPr>
-          <w:rFonts w:ascii="Calibri" w:hAnsi="Calibri"/>
-          <w:b/>
-          <w:i w:val="0"/>
-          <w:color w:val="2B2B2B"/>
-          <w:sz w:val="21"/>
-        </w:rPr>
-        <w:t>unfollowed.info</w:t>
-      </w:r>
-      <w:r>
-        <w:rPr>
-          <w:rFonts w:ascii="Calibri" w:hAnsi="Calibri"/>
-          <w:b w:val="0"/>
-          <w:i/>
-          <w:color w:val="5A5A5A"/>
-          <w:sz w:val="20"/>
-        </w:rPr>
-        <w:t xml:space="preserve">  —  consumer web application, built and operated solo</w:t>
-      </w:r>
-    </w:p>
-    <w:p>
-      <w:pPr>
-        <w:pStyle w:val="ListBullet"/>
-        <w:spacing w:before="0" w:after="30" w:line="254" w:lineRule="auto"/>
-        <w:ind w:left="274" w:hanging="202"/>
-      </w:pPr>
-      <w:r>
-        <w:rPr>
-          <w:rFonts w:ascii="Calibri" w:hAnsi="Calibri"/>
-          <w:b w:val="0"/>
-          <w:i w:val="0"/>
-          <w:color w:val="2B2B2B"/>
-          <w:sz w:val="19"/>
-        </w:rPr>
-        <w:t>Averages 30,000 monthly active users, served from Cloudflare's edge network.</w:t>
-      </w:r>
-    </w:p>
-    <w:p>
-      <w:pPr>
-        <w:pStyle w:val="ListBullet"/>
-        <w:spacing w:before="0" w:after="30" w:line="254" w:lineRule="auto"/>
-        <w:ind w:left="274" w:hanging="202"/>
-      </w:pPr>
-      <w:r>
-        <w:rPr>
-          <w:rFonts w:ascii="Calibri" w:hAnsi="Calibri"/>
-          <w:b w:val="0"/>
-          <w:i w:val="0"/>
-          <w:color w:val="2B2B2B"/>
-          <w:sz w:val="19"/>
-        </w:rPr>
-        <w:t>Sole owner across product, frontend, backend, and infrastructure — including ongoing features shipped to production with Claude Code and Devin.</w:t>
-      </w:r>
-    </w:p>
-    <w:p>
-      <w:pPr>
-        <w:spacing w:before="220" w:after="60"/>
-        <w:pBdr>
-          <w:bottom w:val="single" w:sz="6" w:space="2" w:color="B9C4D0"/>
-        </w:pBdr>
-      </w:pPr>
-      <w:r>
-        <w:rPr>
-          <w:rFonts w:ascii="Calibri" w:hAnsi="Calibri"/>
-          <w:b/>
-          <w:i w:val="0"/>
-          <w:color w:val="1F3A5F"/>
-          <w:sz w:val="19"/>
-          <w:spacing w:val="32"/>
-        </w:rPr>
         <w:t>EDUCATION</w:t>
       </w:r>
     </w:p>

</xml_diff>

<commit_message>
Move Checklist up in Active Deploys and trim its description
Checklist now sits second, after the resume itself, instead of last, and its
line drops the 2:00 AM reset detail to read "daily checklist, data kept
entirely in the browser's localStorage and served as a static-asset Worker
with no backend." The Word resume carries the same edit.

Co-Authored-By: Claude Opus 5 <noreply@anthropic.com>
</commit_message>
<xml_diff>
--- a/public/Matthew_DeVoss_FDE_Resume.docx
+++ b/public/Matthew_DeVoss_FDE_Resume.docx
@@ -187,6 +187,34 @@
       <w:pPr>
         <w:spacing w:before="60" w:after="0"/>
       </w:pPr>
+      <w:hyperlink r:id="rIdDeploy5">
+        <w:r>
+          <w:rPr>
+            <w:rFonts w:ascii="Calibri" w:hAnsi="Calibri"/>
+            <w:b/>
+            <w:i w:val="0"/>
+            <w:color w:val="1F3A5F"/>
+            <w:sz w:val="19"/>
+            <w:u w:val="single"/>
+          </w:rPr>
+          <w:t>checklist.mattdevoss.workers.dev</w:t>
+        </w:r>
+      </w:hyperlink>
+      <w:r>
+        <w:rPr>
+          <w:rFonts w:ascii="Calibri" w:hAnsi="Calibri"/>
+          <w:b w:val="0"/>
+          <w:i w:val="0"/>
+          <w:color w:val="2B2B2B"/>
+          <w:sz w:val="19"/>
+        </w:rPr>
+        <w:t xml:space="preserve">  —  daily checklist, data kept entirely in the browser’s localStorage and served as a static-asset Worker with no backend.</w:t>
+      </w:r>
+    </w:p>
+    <w:p>
+      <w:pPr>
+        <w:spacing w:before="60" w:after="0"/>
+      </w:pPr>
       <w:hyperlink r:id="rIdDeploy1">
         <w:r>
           <w:rPr>
@@ -293,34 +321,6 @@
           <w:sz w:val="19"/>
         </w:rPr>
         <w:t xml:space="preserve">  —  30,000 monthly active users. Site gives code snippet to find out who doesn’t follow you back on Instagram.</w:t>
-      </w:r>
-    </w:p>
-    <w:p>
-      <w:pPr>
-        <w:spacing w:before="60" w:after="0"/>
-      </w:pPr>
-      <w:hyperlink r:id="rIdDeploy5">
-        <w:r>
-          <w:rPr>
-            <w:rFonts w:ascii="Calibri" w:hAnsi="Calibri"/>
-            <w:b/>
-            <w:i w:val="0"/>
-            <w:color w:val="1F3A5F"/>
-            <w:sz w:val="19"/>
-            <w:u w:val="single"/>
-          </w:rPr>
-          <w:t>checklist.mattdevoss.workers.dev</w:t>
-        </w:r>
-      </w:hyperlink>
-      <w:r>
-        <w:rPr>
-          <w:rFonts w:ascii="Calibri" w:hAnsi="Calibri"/>
-          <w:b w:val="0"/>
-          <w:i w:val="0"/>
-          <w:color w:val="2B2B2B"/>
-          <w:sz w:val="19"/>
-        </w:rPr>
-        <w:t xml:space="preserve">  —  daily checklist that clears its checks at 2:00 AM local time, kept entirely in the browser’s localStorage and served as a static-asset Worker with no backend.</w:t>
       </w:r>
     </w:p>
     <w:p>

</xml_diff>

<commit_message>
Move just-go to second in resume Active Deploys
Co-Authored-By: Claude Opus 5.5 <noreply@anthropic.com>
</commit_message>
<xml_diff>
--- a/public/Matthew_DeVoss_FDE_Resume.docx
+++ b/public/Matthew_DeVoss_FDE_Resume.docx
@@ -187,6 +187,34 @@
       <w:pPr>
         <w:spacing w:before="60" w:after="0"/>
       </w:pPr>
+      <w:hyperlink r:id="rIdDeploy3">
+        <w:r>
+          <w:rPr>
+            <w:rFonts w:ascii="Calibri" w:hAnsi="Calibri"/>
+            <w:b/>
+            <w:i w:val="0"/>
+            <w:color w:val="1F3A5F"/>
+            <w:sz w:val="19"/>
+            <w:u w:val="single"/>
+          </w:rPr>
+          <w:t>just-go.mattdevoss.workers.dev</w:t>
+        </w:r>
+      </w:hyperlink>
+      <w:r>
+        <w:rPr>
+          <w:rFonts w:ascii="Calibri" w:hAnsi="Calibri"/>
+          <w:b w:val="0"/>
+          <w:i w:val="0"/>
+          <w:color w:val="2B2B2B"/>
+          <w:sz w:val="19"/>
+        </w:rPr>
+        <w:t xml:space="preserve">  —  random-destination trip picker that draws the great-circle route from LAX on a three.js globe, built so page loads never touch a paid API.</w:t>
+      </w:r>
+    </w:p>
+    <w:p>
+      <w:pPr>
+        <w:spacing w:before="60" w:after="0"/>
+      </w:pPr>
       <w:hyperlink r:id="rIdDeploy5">
         <w:r>
           <w:rPr>
@@ -265,34 +293,6 @@
           <w:sz w:val="19"/>
         </w:rPr>
         <w:t xml:space="preserve">  —  server-rendered newspaper for my father’s business</w:t>
-      </w:r>
-    </w:p>
-    <w:p>
-      <w:pPr>
-        <w:spacing w:before="60" w:after="0"/>
-      </w:pPr>
-      <w:hyperlink r:id="rIdDeploy3">
-        <w:r>
-          <w:rPr>
-            <w:rFonts w:ascii="Calibri" w:hAnsi="Calibri"/>
-            <w:b/>
-            <w:i w:val="0"/>
-            <w:color w:val="1F3A5F"/>
-            <w:sz w:val="19"/>
-            <w:u w:val="single"/>
-          </w:rPr>
-          <w:t>just-go.mattdevoss.workers.dev</w:t>
-        </w:r>
-      </w:hyperlink>
-      <w:r>
-        <w:rPr>
-          <w:rFonts w:ascii="Calibri" w:hAnsi="Calibri"/>
-          <w:b w:val="0"/>
-          <w:i w:val="0"/>
-          <w:color w:val="2B2B2B"/>
-          <w:sz w:val="19"/>
-        </w:rPr>
-        <w:t xml:space="preserve">  —  random-destination trip picker that draws the great-circle route from LAX on a three.js globe, built so page loads never touch a paid API.</w:t>
       </w:r>
     </w:p>
     <w:p>

</xml_diff>

<commit_message>
Move checklist after dodgers-dashboard in resume Active Deploys
Co-Authored-By: Claude Opus 5.5 <noreply@anthropic.com>
</commit_message>
<xml_diff>
--- a/public/Matthew_DeVoss_FDE_Resume.docx
+++ b/public/Matthew_DeVoss_FDE_Resume.docx
@@ -215,6 +215,34 @@
       <w:pPr>
         <w:spacing w:before="60" w:after="0"/>
       </w:pPr>
+      <w:hyperlink r:id="rIdDeploy1">
+        <w:r>
+          <w:rPr>
+            <w:rFonts w:ascii="Calibri" w:hAnsi="Calibri"/>
+            <w:b/>
+            <w:i w:val="0"/>
+            <w:color w:val="1F3A5F"/>
+            <w:sz w:val="19"/>
+            <w:u w:val="single"/>
+          </w:rPr>
+          <w:t>dodgers-dashboard.mattdevoss.workers.dev</w:t>
+        </w:r>
+      </w:hyperlink>
+      <w:r>
+        <w:rPr>
+          <w:rFonts w:ascii="Calibri" w:hAnsi="Calibri"/>
+          <w:b w:val="0"/>
+          <w:i w:val="0"/>
+          <w:color w:val="2B2B2B"/>
+          <w:sz w:val="19"/>
+        </w:rPr>
+        <w:t xml:space="preserve">  —  single-page Dodgers dashboard over the MLB Stats API: schedule, standings, roster, and a merged news feed, with edge-cached Worker routes and AI-written trade scenarios via Claude.</w:t>
+      </w:r>
+    </w:p>
+    <w:p>
+      <w:pPr>
+        <w:spacing w:before="60" w:after="0"/>
+      </w:pPr>
       <w:hyperlink r:id="rIdDeploy5">
         <w:r>
           <w:rPr>
@@ -237,34 +265,6 @@
           <w:sz w:val="19"/>
         </w:rPr>
         <w:t xml:space="preserve">  —  daily checklist, data kept entirely in the browser’s localStorage and served as a static-asset Worker with no backend.</w:t>
-      </w:r>
-    </w:p>
-    <w:p>
-      <w:pPr>
-        <w:spacing w:before="60" w:after="0"/>
-      </w:pPr>
-      <w:hyperlink r:id="rIdDeploy1">
-        <w:r>
-          <w:rPr>
-            <w:rFonts w:ascii="Calibri" w:hAnsi="Calibri"/>
-            <w:b/>
-            <w:i w:val="0"/>
-            <w:color w:val="1F3A5F"/>
-            <w:sz w:val="19"/>
-            <w:u w:val="single"/>
-          </w:rPr>
-          <w:t>dodgers-dashboard.mattdevoss.workers.dev</w:t>
-        </w:r>
-      </w:hyperlink>
-      <w:r>
-        <w:rPr>
-          <w:rFonts w:ascii="Calibri" w:hAnsi="Calibri"/>
-          <w:b w:val="0"/>
-          <w:i w:val="0"/>
-          <w:color w:val="2B2B2B"/>
-          <w:sz w:val="19"/>
-        </w:rPr>
-        <w:t xml:space="preserve">  —  single-page Dodgers dashboard over the MLB Stats API: schedule, standings, roster, and a merged news feed, with edge-cached Worker routes and AI-written trade scenarios via Claude.</w:t>
       </w:r>
     </w:p>
     <w:p>

</xml_diff>